<commit_message>
Consent on blank form: touched boxes only (tick = yes, tick-then-untick = no, untouched = keep); BRD v1.1
Co-authored-by: Copilot <223556219+Copilot@users.noreply.github.com>
</commit_message>
<xml_diff>
--- a/docs/BRD_Login_SignUp_Consent.docx
+++ b/docs/BRD_Login_SignUp_Consent.docx
@@ -103,15 +103,10 @@
           <w:p>
             <w:r>
               <w:rPr>
-                <w:sz w:val="19"/>
-              </w:rPr>
-            </w:r>
-            <w:r>
-              <w:rPr>
                 <w:b w:val="0"/>
                 <w:sz w:val="19"/>
               </w:rPr>
-              <w:t>1.0 (draft for review)</w:t>
+              <w:t>1.1 (draft for review): touched-box consent rule and API timing added</w:t>
             </w:r>
           </w:p>
         </w:tc>
@@ -593,22 +588,17 @@
           <w:p>
             <w:r>
               <w:rPr>
-                <w:sz w:val="19"/>
-              </w:rPr>
-            </w:r>
-            <w:r>
-              <w:rPr>
                 <w:b/>
                 <w:sz w:val="19"/>
               </w:rPr>
-              <w:t>An empty box means “not answered”, never “withdrawn”.</w:t>
+              <w:t>An untouched box means “not answered”, never “withdrawn”.</w:t>
             </w:r>
             <w:r>
               <w:rPr>
                 <w:b w:val="0"/>
                 <w:sz w:val="19"/>
               </w:rPr>
-              <w:t xml:space="preserve"> The system must never remove a saved consent because a box was left empty.</w:t>
+              <w:t xml:space="preserve"> The system must never remove a saved consent because a box was simply left empty.</w:t>
             </w:r>
           </w:p>
         </w:tc>
@@ -640,22 +630,17 @@
           <w:p>
             <w:r>
               <w:rPr>
-                <w:sz w:val="19"/>
-              </w:rPr>
-            </w:r>
-            <w:r>
-              <w:rPr>
                 <w:b/>
                 <w:sz w:val="19"/>
               </w:rPr>
-              <w:t>Withdrawal needs an explicit action:</w:t>
+              <w:t>A deliberate untick is a “no” and must be honoured.</w:t>
             </w:r>
             <w:r>
               <w:rPr>
                 <w:b w:val="0"/>
                 <w:sz w:val="19"/>
               </w:rPr>
-              <w:t xml:space="preserve"> the customer unticks a box that was shown to them as ticked (their real saved state), or uses the preferences screen.</w:t>
+              <w:t xml:space="preserve"> If the customer ticks a box and then unticks it, that consent is withdrawn (when in doubt, do not contact). Withdrawal is also possible any time from the preferences screen.</w:t>
             </w:r>
           </w:p>
         </w:tc>
@@ -1871,13 +1856,7 @@
         <w:rPr>
           <w:b w:val="0"/>
         </w:rPr>
-        <w:t>Heading: “This email is linked to another account”. The other account’s number is masked (</w:t>
-      </w:r>
-      <w:r>
-        <w:rPr>
-          <w:b/>
-        </w:rPr>
-        <w:t>3469).</w:t>
+        <w:t>Heading: “This email is linked to another account”. The other account’s number is masked (******3469).</w:t>
       </w:r>
     </w:p>
     <w:p>
@@ -1888,13 +1867,7 @@
         <w:rPr>
           <w:b w:val="0"/>
         </w:rPr>
-        <w:t xml:space="preserve">Option 1: “Sign in with </w:t>
-      </w:r>
-      <w:r>
-        <w:rPr>
-          <w:b/>
-        </w:rPr>
-        <w:t>3469”: OTP to that number; customer is signed in to the existing account.</w:t>
+        <w:t>Option 1: “Sign in with ******3469”: OTP to that number; customer is signed in to the existing account.</w:t>
       </w:r>
     </w:p>
     <w:p>
@@ -2647,23 +2620,17 @@
         <w:rPr>
           <w:b w:val="0"/>
         </w:rPr>
-        <w:t xml:space="preserve"> recommend showing the number masked (+91 </w:t>
+        <w:t xml:space="preserve"> recommend showing the number masked (+91 ******3210) with “Not you? Use another number”, and add “Forget this device” in the account menu. </w:t>
       </w:r>
       <w:r>
         <w:rPr>
           <w:b/>
         </w:rPr>
-        <w:t xml:space="preserve">3210) with “Not you? Use another number”, and add “Forget this device” in the account menu. </w:t>
+        <w:t>[Business]</w:t>
       </w:r>
       <w:r>
         <w:rPr>
           <w:b w:val="0"/>
-        </w:rPr>
-        <w:t>[Business]</w:t>
-      </w:r>
-      <w:r>
-        <w:rPr>
-          <w:b/>
         </w:rPr>
         <w:t xml:space="preserve"> decide masked vs full; the prototype shows the full number.</w:t>
       </w:r>
@@ -2780,18 +2747,19 @@
             <w:shd w:val="clear" w:color="auto" w:fill="FBEFF2"/>
           </w:tcPr>
           <w:p>
-            <w:r/>
             <w:r>
               <w:rPr>
                 <w:b/>
-              </w:rPr>
-              <w:t>Rule: on a blank form, the customer can only ADD consent. Nothing is ever removed.</w:t>
+                <w:sz w:val="19"/>
+              </w:rPr>
+              <w:t>Rule: on a blank form, only the boxes the customer touched change.</w:t>
             </w:r>
             <w:r>
               <w:rPr>
                 <w:b w:val="0"/>
-              </w:rPr>
-              <w:t xml:space="preserve"> After the OTP proves who they are, they see their real saved preferences and can change them there.</w:t>
+                <w:sz w:val="19"/>
+              </w:rPr>
+              <w:t xml:space="preserve"> Untouched = keep what is saved. Ticked = yes. Ticked then unticked = no. After the OTP they see the final result and can change it again.</w:t>
             </w:r>
           </w:p>
         </w:tc>
@@ -2858,11 +2826,6 @@
           <w:p>
             <w:r>
               <w:rPr>
-                <w:sz w:val="19"/>
-              </w:rPr>
-            </w:r>
-            <w:r>
-              <w:rPr>
                 <w:b w:val="0"/>
                 <w:sz w:val="19"/>
               </w:rPr>
@@ -2877,15 +2840,24 @@
           <w:p>
             <w:r>
               <w:rPr>
-                <w:sz w:val="19"/>
-              </w:rPr>
-            </w:r>
-            <w:r>
-              <w:rPr>
                 <w:b w:val="0"/>
                 <w:sz w:val="19"/>
               </w:rPr>
-              <w:t>Blank, unticked boxes. Record which boxes the customer actually ticked (“touched”).</w:t>
+              <w:t xml:space="preserve">Blank, unticked boxes. The front end records </w:t>
+            </w:r>
+            <w:r>
+              <w:rPr>
+                <w:b/>
+                <w:sz w:val="19"/>
+              </w:rPr>
+              <w:t>which boxes the customer touched</w:t>
+            </w:r>
+            <w:r>
+              <w:rPr>
+                <w:b w:val="0"/>
+                <w:sz w:val="19"/>
+              </w:rPr>
+              <w:t xml:space="preserve"> (clicked at least once) and their final state. Nothing is sent to the server yet.</w:t>
             </w:r>
           </w:p>
         </w:tc>
@@ -2898,11 +2870,6 @@
           <w:p>
             <w:r>
               <w:rPr>
-                <w:sz w:val="19"/>
-              </w:rPr>
-            </w:r>
-            <w:r>
-              <w:rPr>
                 <w:b w:val="0"/>
                 <w:sz w:val="19"/>
               </w:rPr>
@@ -2917,29 +2884,52 @@
           <w:p>
             <w:r>
               <w:rPr>
-                <w:sz w:val="19"/>
-              </w:rPr>
-            </w:r>
-            <w:r>
-              <w:rPr>
                 <w:b w:val="0"/>
                 <w:sz w:val="19"/>
               </w:rPr>
-              <w:t xml:space="preserve">Fetch saved consent from the server. If nothing was touched → no change. If boxes were ticked → </w:t>
+              <w:t xml:space="preserve">Send only the touched boxes (section 6.4). Server: touched + ticked → </w:t>
             </w:r>
             <w:r>
               <w:rPr>
                 <w:b/>
                 <w:sz w:val="19"/>
               </w:rPr>
-              <w:t>saved consent OR newly ticked</w:t>
+              <w:t>grant</w:t>
             </w:r>
             <w:r>
               <w:rPr>
                 <w:b w:val="0"/>
                 <w:sz w:val="19"/>
               </w:rPr>
-              <w:t xml:space="preserve"> (union). Unticked boxes are ignored.</w:t>
+              <w:t xml:space="preserve">; touched + unticked → </w:t>
+            </w:r>
+            <w:r>
+              <w:rPr>
+                <w:b/>
+                <w:sz w:val="19"/>
+              </w:rPr>
+              <w:t>withdraw</w:t>
+            </w:r>
+            <w:r>
+              <w:rPr>
+                <w:b w:val="0"/>
+                <w:sz w:val="19"/>
+              </w:rPr>
+              <w:t xml:space="preserve">; untouched → </w:t>
+            </w:r>
+            <w:r>
+              <w:rPr>
+                <w:b/>
+                <w:sz w:val="19"/>
+              </w:rPr>
+              <w:t>no change</w:t>
+            </w:r>
+            <w:r>
+              <w:rPr>
+                <w:b w:val="0"/>
+                <w:sz w:val="19"/>
+              </w:rPr>
+              <w:t>. If nothing was touched, send nothing.</w:t>
             </w:r>
           </w:p>
         </w:tc>
@@ -2952,11 +2942,6 @@
           <w:p>
             <w:r>
               <w:rPr>
-                <w:sz w:val="19"/>
-              </w:rPr>
-            </w:r>
-            <w:r>
-              <w:rPr>
                 <w:b w:val="0"/>
                 <w:sz w:val="19"/>
               </w:rPr>
@@ -2971,15 +2956,10 @@
           <w:p>
             <w:r>
               <w:rPr>
-                <w:sz w:val="19"/>
-              </w:rPr>
-            </w:r>
-            <w:r>
-              <w:rPr>
                 <w:b w:val="0"/>
                 <w:sz w:val="19"/>
               </w:rPr>
-              <w:t>Show their saved preferences as stored on the server (summary + Edit). If they have none, show the boxes open so they can opt in. This is where withdrawal happens, as an explicit untick, saved immediately.</w:t>
+              <w:t>Show their preferences as now stored on the server (summary + Edit). If they have none, show the boxes open so they can opt in. Any change here saves immediately.</w:t>
             </w:r>
           </w:p>
         </w:tc>
@@ -2992,11 +2972,6 @@
           <w:p>
             <w:r>
               <w:rPr>
-                <w:sz w:val="19"/>
-              </w:rPr>
-            </w:r>
-            <w:r>
-              <w:rPr>
                 <w:b w:val="0"/>
                 <w:sz w:val="19"/>
               </w:rPr>
@@ -3011,15 +2986,10 @@
           <w:p>
             <w:r>
               <w:rPr>
-                <w:sz w:val="19"/>
-              </w:rPr>
-            </w:r>
-            <w:r>
-              <w:rPr>
                 <w:b w:val="0"/>
                 <w:sz w:val="19"/>
               </w:rPr>
-              <w:t>Whatever is ticked becomes their consent; anything unticked is recorded as “not given”.</w:t>
+              <w:t>Whatever is ticked becomes their consent; everything else is recorded as “not given”.</w:t>
             </w:r>
           </w:p>
         </w:tc>
@@ -3076,13 +3046,13 @@
               <w:rPr>
                 <w:sz w:val="19"/>
               </w:rPr>
+              <w:t>What he did on the blank first screen</w:t>
             </w:r>
             <w:r>
               <w:rPr>
                 <w:b/>
                 <w:sz w:val="19"/>
               </w:rPr>
-              <w:t>Ticked on blank first screen (incognito)</w:t>
             </w:r>
           </w:p>
         </w:tc>
@@ -3110,14 +3080,9 @@
       <w:tr>
         <w:tc>
           <w:tcPr>
-            <w:tcW w:type="dxa" w:w="2835"/>
+            <w:tcW w:type="dxa" w:w="3249"/>
           </w:tcPr>
           <w:p>
-            <w:r>
-              <w:rPr>
-                <w:sz w:val="19"/>
-              </w:rPr>
-            </w:r>
             <w:r>
               <w:rPr>
                 <w:b w:val="0"/>
@@ -3129,33 +3094,23 @@
         </w:tc>
         <w:tc>
           <w:tcPr>
-            <w:tcW w:type="dxa" w:w="3118"/>
+            <w:tcW w:type="dxa" w:w="3249"/>
           </w:tcPr>
           <w:p>
             <w:r>
               <w:rPr>
-                <w:sz w:val="19"/>
-              </w:rPr>
-            </w:r>
-            <w:r>
-              <w:rPr>
                 <w:b w:val="0"/>
                 <w:sz w:val="19"/>
               </w:rPr>
-              <w:t>Nothing</w:t>
+              <w:t>Nothing touched</w:t>
             </w:r>
           </w:p>
         </w:tc>
         <w:tc>
           <w:tcPr>
-            <w:tcW w:type="dxa" w:w="3402"/>
+            <w:tcW w:type="dxa" w:w="3249"/>
           </w:tcPr>
           <w:p>
-            <w:r>
-              <w:rPr>
-                <w:sz w:val="19"/>
-              </w:rPr>
-            </w:r>
             <w:r>
               <w:rPr>
                 <w:b w:val="0"/>
@@ -3169,14 +3124,9 @@
       <w:tr>
         <w:tc>
           <w:tcPr>
-            <w:tcW w:type="dxa" w:w="2835"/>
+            <w:tcW w:type="dxa" w:w="3249"/>
           </w:tcPr>
           <w:p>
-            <w:r>
-              <w:rPr>
-                <w:sz w:val="19"/>
-              </w:rPr>
-            </w:r>
             <w:r>
               <w:rPr>
                 <w:b w:val="0"/>
@@ -3188,33 +3138,23 @@
         </w:tc>
         <w:tc>
           <w:tcPr>
-            <w:tcW w:type="dxa" w:w="3118"/>
+            <w:tcW w:type="dxa" w:w="3249"/>
           </w:tcPr>
           <w:p>
             <w:r>
               <w:rPr>
-                <w:sz w:val="19"/>
-              </w:rPr>
-            </w:r>
-            <w:r>
-              <w:rPr>
                 <w:b w:val="0"/>
                 <w:sz w:val="19"/>
               </w:rPr>
-              <w:t>Personalisation</w:t>
+              <w:t>Ticks personalisation</w:t>
             </w:r>
           </w:p>
         </w:tc>
         <w:tc>
           <w:tcPr>
-            <w:tcW w:type="dxa" w:w="3402"/>
+            <w:tcW w:type="dxa" w:w="3249"/>
           </w:tcPr>
           <w:p>
-            <w:r>
-              <w:rPr>
-                <w:sz w:val="19"/>
-              </w:rPr>
-            </w:r>
             <w:r>
               <w:rPr>
                 <w:b w:val="0"/>
@@ -3235,14 +3175,9 @@
       <w:tr>
         <w:tc>
           <w:tcPr>
-            <w:tcW w:type="dxa" w:w="2835"/>
+            <w:tcW w:type="dxa" w:w="3249"/>
           </w:tcPr>
           <w:p>
-            <w:r>
-              <w:rPr>
-                <w:sz w:val="19"/>
-              </w:rPr>
-            </w:r>
             <w:r>
               <w:rPr>
                 <w:b w:val="0"/>
@@ -3254,33 +3189,23 @@
         </w:tc>
         <w:tc>
           <w:tcPr>
-            <w:tcW w:type="dxa" w:w="3118"/>
+            <w:tcW w:type="dxa" w:w="3249"/>
           </w:tcPr>
           <w:p>
             <w:r>
               <w:rPr>
-                <w:sz w:val="19"/>
-              </w:rPr>
-            </w:r>
-            <w:r>
-              <w:rPr>
                 <w:b w:val="0"/>
                 <w:sz w:val="19"/>
               </w:rPr>
-              <w:t>Marketing → Call only</w:t>
+              <w:t>Ticks Call</w:t>
             </w:r>
           </w:p>
         </w:tc>
         <w:tc>
           <w:tcPr>
-            <w:tcW w:type="dxa" w:w="3402"/>
+            <w:tcW w:type="dxa" w:w="3249"/>
           </w:tcPr>
           <w:p>
-            <w:r>
-              <w:rPr>
-                <w:sz w:val="19"/>
-              </w:rPr>
-            </w:r>
             <w:r>
               <w:rPr>
                 <w:b w:val="0"/>
@@ -3308,58 +3233,57 @@
       <w:tr>
         <w:tc>
           <w:tcPr>
-            <w:tcW w:type="dxa" w:w="2835"/>
+            <w:tcW w:type="dxa" w:w="3249"/>
           </w:tcPr>
           <w:p>
             <w:r>
               <w:rPr>
-                <w:sz w:val="19"/>
-              </w:rPr>
-            </w:r>
-            <w:r>
-              <w:rPr>
                 <w:b w:val="0"/>
                 <w:sz w:val="19"/>
               </w:rPr>
-              <w:t>All on</w:t>
+              <w:t>Email + WhatsApp; personalisation off</w:t>
             </w:r>
           </w:p>
         </w:tc>
         <w:tc>
           <w:tcPr>
-            <w:tcW w:type="dxa" w:w="3118"/>
+            <w:tcW w:type="dxa" w:w="3249"/>
           </w:tcPr>
           <w:p>
             <w:r>
               <w:rPr>
-                <w:sz w:val="19"/>
-              </w:rPr>
-            </w:r>
-            <w:r>
-              <w:rPr>
                 <w:b w:val="0"/>
                 <w:sz w:val="19"/>
               </w:rPr>
-              <w:t>Nothing</w:t>
+              <w:t>Ticks WhatsApp, then unticks it</w:t>
             </w:r>
           </w:p>
         </w:tc>
         <w:tc>
           <w:tcPr>
-            <w:tcW w:type="dxa" w:w="3402"/>
+            <w:tcW w:type="dxa" w:w="3249"/>
           </w:tcPr>
           <w:p>
             <w:r>
               <w:rPr>
-                <w:sz w:val="19"/>
-              </w:rPr>
-            </w:r>
-            <w:r>
-              <w:rPr>
                 <w:b w:val="0"/>
                 <w:sz w:val="19"/>
               </w:rPr>
-              <w:t>Unchanged: all on</w:t>
+              <w:t xml:space="preserve">Email only. </w:t>
+            </w:r>
+            <w:r>
+              <w:rPr>
+                <w:b/>
+                <w:sz w:val="19"/>
+              </w:rPr>
+              <w:t>WhatsApp withdrawn</w:t>
+            </w:r>
+            <w:r>
+              <w:rPr>
+                <w:b w:val="0"/>
+                <w:sz w:val="19"/>
+              </w:rPr>
+              <w:t xml:space="preserve"> (his last action was “no”)</w:t>
             </w:r>
           </w:p>
         </w:tc>
@@ -3367,58 +3291,50 @@
       <w:tr>
         <w:tc>
           <w:tcPr>
-            <w:tcW w:type="dxa" w:w="2835"/>
+            <w:tcW w:type="dxa" w:w="3249"/>
           </w:tcPr>
           <w:p>
             <w:r>
               <w:rPr>
-                <w:sz w:val="19"/>
-              </w:rPr>
-            </w:r>
-            <w:r>
-              <w:rPr>
                 <w:b w:val="0"/>
                 <w:sz w:val="19"/>
               </w:rPr>
-              <w:t>Nothing</w:t>
+              <w:t>Email + WhatsApp; personalisation off</w:t>
             </w:r>
           </w:p>
         </w:tc>
         <w:tc>
           <w:tcPr>
-            <w:tcW w:type="dxa" w:w="3118"/>
+            <w:tcW w:type="dxa" w:w="3249"/>
           </w:tcPr>
           <w:p>
             <w:r>
               <w:rPr>
-                <w:sz w:val="19"/>
-              </w:rPr>
-            </w:r>
-            <w:r>
-              <w:rPr>
                 <w:b w:val="0"/>
                 <w:sz w:val="19"/>
               </w:rPr>
-              <w:t>Email</w:t>
+              <w:t>Ticks marketing (all 4 channels tick), then unticks marketing</w:t>
             </w:r>
           </w:p>
         </w:tc>
         <w:tc>
           <w:tcPr>
-            <w:tcW w:type="dxa" w:w="3402"/>
+            <w:tcW w:type="dxa" w:w="3249"/>
           </w:tcPr>
           <w:p>
             <w:r>
               <w:rPr>
-                <w:sz w:val="19"/>
-              </w:rPr>
+                <w:b/>
+                <w:sz w:val="19"/>
+              </w:rPr>
+              <w:t>All marketing withdrawn</w:t>
             </w:r>
             <w:r>
               <w:rPr>
                 <w:b w:val="0"/>
                 <w:sz w:val="19"/>
               </w:rPr>
-              <w:t>Email on</w:t>
+              <w:t>; personalisation off</w:t>
             </w:r>
           </w:p>
         </w:tc>
@@ -3426,52 +3342,125 @@
       <w:tr>
         <w:tc>
           <w:tcPr>
-            <w:tcW w:type="dxa" w:w="2835"/>
+            <w:tcW w:type="dxa" w:w="3249"/>
           </w:tcPr>
           <w:p>
             <w:r>
               <w:rPr>
-                <w:sz w:val="19"/>
-              </w:rPr>
-            </w:r>
-            <w:r>
-              <w:rPr>
                 <w:b w:val="0"/>
                 <w:sz w:val="19"/>
               </w:rPr>
-              <w:t>New customer</w:t>
+              <w:t>WhatsApp off</w:t>
             </w:r>
           </w:p>
         </w:tc>
         <w:tc>
           <w:tcPr>
-            <w:tcW w:type="dxa" w:w="3118"/>
+            <w:tcW w:type="dxa" w:w="3249"/>
           </w:tcPr>
           <w:p>
             <w:r>
               <w:rPr>
-                <w:sz w:val="19"/>
-              </w:rPr>
-            </w:r>
-            <w:r>
-              <w:rPr>
                 <w:b w:val="0"/>
                 <w:sz w:val="19"/>
               </w:rPr>
-              <w:t>Nothing</w:t>
+              <w:t>Ticks WhatsApp, then unticks it</w:t>
             </w:r>
           </w:p>
         </w:tc>
         <w:tc>
           <w:tcPr>
-            <w:tcW w:type="dxa" w:w="3402"/>
+            <w:tcW w:type="dxa" w:w="3249"/>
           </w:tcPr>
           <w:p>
             <w:r>
               <w:rPr>
-                <w:sz w:val="19"/>
-              </w:rPr>
-            </w:r>
+                <w:b w:val="0"/>
+                <w:sz w:val="19"/>
+              </w:rPr>
+              <w:t>Unchanged: WhatsApp off</w:t>
+            </w:r>
+          </w:p>
+        </w:tc>
+      </w:tr>
+      <w:tr>
+        <w:tc>
+          <w:tcPr>
+            <w:tcW w:type="dxa" w:w="3249"/>
+          </w:tcPr>
+          <w:p>
+            <w:r>
+              <w:rPr>
+                <w:b w:val="0"/>
+                <w:sz w:val="19"/>
+              </w:rPr>
+              <w:t>All on</w:t>
+            </w:r>
+          </w:p>
+        </w:tc>
+        <w:tc>
+          <w:tcPr>
+            <w:tcW w:type="dxa" w:w="3249"/>
+          </w:tcPr>
+          <w:p>
+            <w:r>
+              <w:rPr>
+                <w:b w:val="0"/>
+                <w:sz w:val="19"/>
+              </w:rPr>
+              <w:t>Nothing touched</w:t>
+            </w:r>
+          </w:p>
+        </w:tc>
+        <w:tc>
+          <w:tcPr>
+            <w:tcW w:type="dxa" w:w="3249"/>
+          </w:tcPr>
+          <w:p>
+            <w:r>
+              <w:rPr>
+                <w:b w:val="0"/>
+                <w:sz w:val="19"/>
+              </w:rPr>
+              <w:t>Unchanged: all on</w:t>
+            </w:r>
+          </w:p>
+        </w:tc>
+      </w:tr>
+      <w:tr>
+        <w:tc>
+          <w:tcPr>
+            <w:tcW w:type="dxa" w:w="3249"/>
+          </w:tcPr>
+          <w:p>
+            <w:r>
+              <w:rPr>
+                <w:b w:val="0"/>
+                <w:sz w:val="19"/>
+              </w:rPr>
+              <w:t>New customer</w:t>
+            </w:r>
+          </w:p>
+        </w:tc>
+        <w:tc>
+          <w:tcPr>
+            <w:tcW w:type="dxa" w:w="3249"/>
+          </w:tcPr>
+          <w:p>
+            <w:r>
+              <w:rPr>
+                <w:b w:val="0"/>
+                <w:sz w:val="19"/>
+              </w:rPr>
+              <w:t>Nothing touched</w:t>
+            </w:r>
+          </w:p>
+        </w:tc>
+        <w:tc>
+          <w:tcPr>
+            <w:tcW w:type="dxa" w:w="3249"/>
+          </w:tcPr>
+          <w:p>
             <w:r>
               <w:rPr>
                 <w:b w:val="0"/>
@@ -3489,7 +3478,467 @@
         <w:rPr>
           <w:b w:val="0"/>
         </w:rPr>
-        <w:t>The prototype now follows this rule (fixed in this release: previously a single tick on a blank form overwrote the whole saved record).</w:t>
+        <w:t>The prototype follows this rule (Mia and Zoya).</w:t>
+      </w:r>
+    </w:p>
+    <w:p>
+      <w:pPr>
+        <w:pStyle w:val="Heading2"/>
+      </w:pPr>
+      <w:r>
+        <w:t>6.4 When and what to send to the API</w:t>
+      </w:r>
+    </w:p>
+    <w:tbl>
+      <w:tblPr>
+        <w:tblStyle w:val="TableGrid"/>
+        <w:tblW w:type="auto" w:w="0"/>
+        <w:tblLook w:firstColumn="1" w:firstRow="1" w:lastColumn="0" w:lastRow="0" w:noHBand="0" w:noVBand="1" w:val="04A0"/>
+      </w:tblPr>
+      <w:tblGrid>
+        <w:gridCol w:w="4873"/>
+        <w:gridCol w:w="4873"/>
+      </w:tblGrid>
+      <w:tr>
+        <w:tc>
+          <w:tcPr>
+            <w:tcW w:type="dxa" w:w="3402"/>
+            <w:shd w:val="clear" w:color="auto" w:fill="F3F1F2"/>
+          </w:tcPr>
+          <w:p>
+            <w:r>
+              <w:rPr>
+                <w:b/>
+                <w:sz w:val="19"/>
+              </w:rPr>
+              <w:t>When</w:t>
+            </w:r>
+          </w:p>
+        </w:tc>
+        <w:tc>
+          <w:tcPr>
+            <w:tcW w:type="dxa" w:w="5953"/>
+            <w:shd w:val="clear" w:color="auto" w:fill="F3F1F2"/>
+          </w:tcPr>
+          <w:p>
+            <w:r>
+              <w:rPr>
+                <w:b/>
+                <w:sz w:val="19"/>
+              </w:rPr>
+              <w:t>Send</w:t>
+            </w:r>
+          </w:p>
+        </w:tc>
+      </w:tr>
+      <w:tr>
+        <w:tc>
+          <w:tcPr>
+            <w:tcW w:type="dxa" w:w="3402"/>
+          </w:tcPr>
+          <w:p>
+            <w:r>
+              <w:rPr>
+                <w:b w:val="0"/>
+                <w:sz w:val="19"/>
+              </w:rPr>
+              <w:t>While on the mobile screen</w:t>
+            </w:r>
+          </w:p>
+        </w:tc>
+        <w:tc>
+          <w:tcPr>
+            <w:tcW w:type="dxa" w:w="5953"/>
+          </w:tcPr>
+          <w:p>
+            <w:r>
+              <w:rPr>
+                <w:b/>
+                <w:sz w:val="19"/>
+              </w:rPr>
+              <w:t>Nothing.</w:t>
+            </w:r>
+            <w:r>
+              <w:rPr>
+                <w:b w:val="0"/>
+                <w:sz w:val="19"/>
+              </w:rPr>
+              <w:t xml:space="preserve"> Ticks are kept in the page only. No consent is saved for an unverified number.</w:t>
+            </w:r>
+          </w:p>
+        </w:tc>
+      </w:tr>
+      <w:tr>
+        <w:tc>
+          <w:tcPr>
+            <w:tcW w:type="dxa" w:w="3402"/>
+          </w:tcPr>
+          <w:p>
+            <w:r>
+              <w:rPr>
+                <w:b w:val="0"/>
+                <w:sz w:val="19"/>
+              </w:rPr>
+              <w:t>Customer goes back from OTP to edit the number</w:t>
+            </w:r>
+          </w:p>
+        </w:tc>
+        <w:tc>
+          <w:tcPr>
+            <w:tcW w:type="dxa" w:w="5953"/>
+          </w:tcPr>
+          <w:p>
+            <w:r>
+              <w:rPr>
+                <w:b w:val="0"/>
+                <w:sz w:val="19"/>
+              </w:rPr>
+              <w:t>Nothing. Touched boxes and their state are kept.</w:t>
+            </w:r>
+          </w:p>
+        </w:tc>
+      </w:tr>
+      <w:tr>
+        <w:tc>
+          <w:tcPr>
+            <w:tcW w:type="dxa" w:w="3402"/>
+          </w:tcPr>
+          <w:p>
+            <w:r>
+              <w:rPr>
+                <w:b w:val="0"/>
+                <w:sz w:val="19"/>
+              </w:rPr>
+              <w:t>OTP verified (returning customer, blank form)</w:t>
+            </w:r>
+          </w:p>
+        </w:tc>
+        <w:tc>
+          <w:tcPr>
+            <w:tcW w:type="dxa" w:w="5953"/>
+          </w:tcPr>
+          <w:p>
+            <w:r>
+              <w:rPr>
+                <w:b/>
+                <w:sz w:val="19"/>
+              </w:rPr>
+              <w:t>One call</w:t>
+            </w:r>
+            <w:r>
+              <w:rPr>
+                <w:b w:val="0"/>
+                <w:sz w:val="19"/>
+              </w:rPr>
+              <w:t xml:space="preserve"> with only the touched boxes and their final state. Skip the call if nothing was touched.</w:t>
+            </w:r>
+          </w:p>
+        </w:tc>
+      </w:tr>
+      <w:tr>
+        <w:tc>
+          <w:tcPr>
+            <w:tcW w:type="dxa" w:w="3402"/>
+          </w:tcPr>
+          <w:p>
+            <w:r>
+              <w:rPr>
+                <w:b w:val="0"/>
+                <w:sz w:val="19"/>
+              </w:rPr>
+              <w:t>OTP verified (remembered device, form showed saved choices)</w:t>
+            </w:r>
+          </w:p>
+        </w:tc>
+        <w:tc>
+          <w:tcPr>
+            <w:tcW w:type="dxa" w:w="5953"/>
+          </w:tcPr>
+          <w:p>
+            <w:r>
+              <w:rPr>
+                <w:b w:val="0"/>
+                <w:sz w:val="19"/>
+              </w:rPr>
+              <w:t>The full state of every box (formState “saved”): the customer saw their real choices, so an untick is a withdrawal.</w:t>
+            </w:r>
+          </w:p>
+        </w:tc>
+      </w:tr>
+      <w:tr>
+        <w:tc>
+          <w:tcPr>
+            <w:tcW w:type="dxa" w:w="3402"/>
+          </w:tcPr>
+          <w:p>
+            <w:r>
+              <w:rPr>
+                <w:b w:val="0"/>
+                <w:sz w:val="19"/>
+              </w:rPr>
+              <w:t>Create account (new customer)</w:t>
+            </w:r>
+          </w:p>
+        </w:tc>
+        <w:tc>
+          <w:tcPr>
+            <w:tcW w:type="dxa" w:w="5953"/>
+          </w:tcPr>
+          <w:p>
+            <w:r>
+              <w:rPr>
+                <w:b w:val="0"/>
+                <w:sz w:val="19"/>
+              </w:rPr>
+              <w:t>The full state of every box with the account-creation call.</w:t>
+            </w:r>
+          </w:p>
+        </w:tc>
+      </w:tr>
+      <w:tr>
+        <w:tc>
+          <w:tcPr>
+            <w:tcW w:type="dxa" w:w="3402"/>
+          </w:tcPr>
+          <w:p>
+            <w:r>
+              <w:rPr>
+                <w:b w:val="0"/>
+                <w:sz w:val="19"/>
+              </w:rPr>
+              <w:t>Welcome back / Preferences screen</w:t>
+            </w:r>
+          </w:p>
+        </w:tc>
+        <w:tc>
+          <w:tcPr>
+            <w:tcW w:type="dxa" w:w="5953"/>
+          </w:tcPr>
+          <w:p>
+            <w:r>
+              <w:rPr>
+                <w:b w:val="0"/>
+                <w:sz w:val="19"/>
+              </w:rPr>
+              <w:t>Each change as it happens (auto-save).</w:t>
+            </w:r>
+          </w:p>
+        </w:tc>
+      </w:tr>
+      <w:tr>
+        <w:tc>
+          <w:tcPr>
+            <w:tcW w:type="dxa" w:w="3402"/>
+          </w:tcPr>
+          <w:p>
+            <w:r>
+              <w:rPr>
+                <w:b w:val="0"/>
+                <w:sz w:val="19"/>
+              </w:rPr>
+              <w:t>Customer closes the pop-up before OTP</w:t>
+            </w:r>
+          </w:p>
+        </w:tc>
+        <w:tc>
+          <w:tcPr>
+            <w:tcW w:type="dxa" w:w="5953"/>
+          </w:tcPr>
+          <w:p>
+            <w:r>
+              <w:rPr>
+                <w:b w:val="0"/>
+                <w:sz w:val="19"/>
+              </w:rPr>
+              <w:t>Nothing.</w:t>
+            </w:r>
+          </w:p>
+        </w:tc>
+      </w:tr>
+    </w:tbl>
+    <w:p/>
+    <w:p>
+      <w:r>
+        <w:rPr>
+          <w:b w:val="0"/>
+        </w:rPr>
+        <w:t>Example request after OTP (blank form; customer ticked personalisation, and ticked then unticked WhatsApp):</w:t>
+      </w:r>
+    </w:p>
+    <w:p>
+      <w:pPr>
+        <w:shd w:val="clear" w:color="auto" w:fill="F6F5F5"/>
+      </w:pPr>
+      <w:r>
+        <w:rPr>
+          <w:rFonts w:ascii="Consolas" w:hAnsi="Consolas" w:eastAsia="Consolas"/>
+          <w:sz w:val="18"/>
+        </w:rPr>
+        <w:t>POST /consent</w:t>
+        <w:br/>
+      </w:r>
+      <w:r>
+        <w:rPr>
+          <w:rFonts w:ascii="Consolas" w:hAnsi="Consolas" w:eastAsia="Consolas"/>
+          <w:sz w:val="18"/>
+        </w:rPr>
+        <w:t>{</w:t>
+        <w:br/>
+      </w:r>
+      <w:r>
+        <w:rPr>
+          <w:rFonts w:ascii="Consolas" w:hAnsi="Consolas" w:eastAsia="Consolas"/>
+          <w:sz w:val="18"/>
+        </w:rPr>
+        <w:t xml:space="preserve">  "customerId": "…",</w:t>
+        <w:br/>
+      </w:r>
+      <w:r>
+        <w:rPr>
+          <w:rFonts w:ascii="Consolas" w:hAnsi="Consolas" w:eastAsia="Consolas"/>
+          <w:sz w:val="18"/>
+        </w:rPr>
+        <w:t xml:space="preserve">  "formState": "blank",            // "blank" | "saved" | "signup"</w:t>
+        <w:br/>
+      </w:r>
+      <w:r>
+        <w:rPr>
+          <w:rFonts w:ascii="Consolas" w:hAnsi="Consolas" w:eastAsia="Consolas"/>
+          <w:sz w:val="18"/>
+        </w:rPr>
+        <w:t xml:space="preserve">  "granted":   ["personalisation"],</w:t>
+        <w:br/>
+      </w:r>
+      <w:r>
+        <w:rPr>
+          <w:rFonts w:ascii="Consolas" w:hAnsi="Consolas" w:eastAsia="Consolas"/>
+          <w:sz w:val="18"/>
+        </w:rPr>
+        <w:t xml:space="preserve">  "withdrawn": ["marketing_whatsapp"],</w:t>
+        <w:br/>
+      </w:r>
+      <w:r>
+        <w:rPr>
+          <w:rFonts w:ascii="Consolas" w:hAnsi="Consolas" w:eastAsia="Consolas"/>
+          <w:sz w:val="18"/>
+        </w:rPr>
+        <w:t xml:space="preserve">  "source": "login",</w:t>
+        <w:br/>
+      </w:r>
+      <w:r>
+        <w:rPr>
+          <w:rFonts w:ascii="Consolas" w:hAnsi="Consolas" w:eastAsia="Consolas"/>
+          <w:sz w:val="18"/>
+        </w:rPr>
+        <w:t xml:space="preserve">  "noticeVersion": "consent-v3"</w:t>
+        <w:br/>
+      </w:r>
+      <w:r>
+        <w:rPr>
+          <w:rFonts w:ascii="Consolas" w:hAnsi="Consolas" w:eastAsia="Consolas"/>
+          <w:sz w:val="18"/>
+        </w:rPr>
+        <w:t>}</w:t>
+      </w:r>
+    </w:p>
+    <w:p>
+      <w:r>
+        <w:rPr>
+          <w:b w:val="0"/>
+        </w:rPr>
+        <w:t>Server rules:</w:t>
+      </w:r>
+    </w:p>
+    <w:p>
+      <w:pPr>
+        <w:pStyle w:val="ListBullet"/>
+      </w:pPr>
+      <w:r>
+        <w:rPr>
+          <w:b w:val="0"/>
+        </w:rPr>
+        <w:t xml:space="preserve">Apply </w:t>
+      </w:r>
+      <w:r>
+        <w:rPr>
+          <w:b/>
+        </w:rPr>
+        <w:t>granted</w:t>
+      </w:r>
+      <w:r>
+        <w:rPr>
+          <w:b w:val="0"/>
+        </w:rPr>
+        <w:t xml:space="preserve"> and </w:t>
+      </w:r>
+      <w:r>
+        <w:rPr>
+          <w:b/>
+        </w:rPr>
+        <w:t>withdrawn</w:t>
+      </w:r>
+      <w:r>
+        <w:rPr>
+          <w:b w:val="0"/>
+        </w:rPr>
+        <w:t xml:space="preserve"> only; every other purpose keeps its saved value.</w:t>
+      </w:r>
+    </w:p>
+    <w:p>
+      <w:pPr>
+        <w:pStyle w:val="ListBullet"/>
+      </w:pPr>
+      <w:r>
+        <w:rPr>
+          <w:b w:val="0"/>
+        </w:rPr>
+        <w:t>Marketing (master) = on if at least one channel is on after the update, otherwise off.</w:t>
+      </w:r>
+    </w:p>
+    <w:p>
+      <w:pPr>
+        <w:pStyle w:val="ListBullet"/>
+      </w:pPr>
+      <w:r>
+        <w:rPr>
+          <w:b w:val="0"/>
+        </w:rPr>
+        <w:t>Write one history row per purpose that changed (section 7). Return the full updated consent so the Welcome back screen shows the true result.</w:t>
+      </w:r>
+    </w:p>
+    <w:p>
+      <w:pPr>
+        <w:pStyle w:val="ListBullet"/>
+      </w:pPr>
+      <w:r>
+        <w:rPr>
+          <w:b w:val="0"/>
+        </w:rPr>
+        <w:t>The merge must happen on the server, so a front-end bug can never wipe saved consent.</w:t>
+      </w:r>
+    </w:p>
+    <w:p>
+      <w:pPr>
+        <w:pStyle w:val="Heading2"/>
+      </w:pPr>
+      <w:r>
+        <w:t>6.5 Why a tick-then-untick counts as “no”</w:t>
+      </w:r>
+    </w:p>
+    <w:p>
+      <w:r>
+        <w:rPr>
+          <w:b w:val="0"/>
+        </w:rPr>
+        <w:t>The customer made a deliberate choice about that channel, and his last action was “no”. Sending a message someone declined is a legal and trust risk; not sending a message someone wanted is only a missed message. So when the signal is unclear, the system does not contact. A box that was never touched carries no signal, so the saved value is kept.</w:t>
+      </w:r>
+    </w:p>
+    <w:p>
+      <w:r>
+        <w:rPr>
+          <w:b w:val="0"/>
+        </w:rPr>
+        <w:t>“Touched” means the customer changed the box at least once. Ticking marketing touches all four channels (it ticks them all), so unticking marketing afterwards withdraws all four.</w:t>
       </w:r>
     </w:p>
     <w:p>
@@ -4575,15 +5024,10 @@
           <w:p>
             <w:r>
               <w:rPr>
-                <w:sz w:val="19"/>
-              </w:rPr>
-            </w:r>
-            <w:r>
-              <w:rPr>
                 <w:b w:val="0"/>
                 <w:sz w:val="19"/>
               </w:rPr>
-              <w:t>Incognito returning customer ticks some boxes</w:t>
+              <w:t>Incognito / new device: returning customer ticks boxes</w:t>
             </w:r>
           </w:p>
         </w:tc>
@@ -4594,15 +5038,10 @@
           <w:p>
             <w:r>
               <w:rPr>
-                <w:sz w:val="19"/>
-              </w:rPr>
-            </w:r>
-            <w:r>
-              <w:rPr>
                 <w:b w:val="0"/>
                 <w:sz w:val="19"/>
               </w:rPr>
-              <w:t>Added to saved consent; nothing removed (section 6).</w:t>
+              <w:t>Ticked boxes are granted; untouched boxes keep their saved value (section 6).</w:t>
             </w:r>
           </w:p>
         </w:tc>
@@ -4803,6 +5242,36 @@
                 <w:sz w:val="19"/>
               </w:rPr>
               <w:t>“Couldn’t save. Try again” inline; no silent failure.</w:t>
+            </w:r>
+          </w:p>
+        </w:tc>
+      </w:tr>
+      <w:tr>
+        <w:tc>
+          <w:tcPr>
+            <w:tcW w:type="dxa" w:w="4873"/>
+          </w:tcPr>
+          <w:p>
+            <w:r>
+              <w:rPr>
+                <w:b w:val="0"/>
+                <w:sz w:val="19"/>
+              </w:rPr>
+              <w:t>Incognito: customer ticks a box, then unticks it</w:t>
+            </w:r>
+          </w:p>
+        </w:tc>
+        <w:tc>
+          <w:tcPr>
+            <w:tcW w:type="dxa" w:w="4873"/>
+          </w:tcPr>
+          <w:p>
+            <w:r>
+              <w:rPr>
+                <w:b w:val="0"/>
+                <w:sz w:val="19"/>
+              </w:rPr>
+              <w:t>Treated as “no”: that consent is withdrawn if it was on (section 6.5).</w:t>
             </w:r>
           </w:p>
         </w:tc>

</xml_diff>